<commit_message>
vault backup: 2026-05-16 12:07:00
</commit_message>
<xml_diff>
--- a/notes/talezzi-questionnaire-vendeur.docx
+++ b/notes/talezzi-questionnaire-vendeur.docx
@@ -13,12 +13,12 @@
       <w:tr>
         <w:tc>
           <w:tcPr>
-            <w:tcW w:type="dxa" w:w="9072"/>
+            <w:tcW w:type="dxa" w:w="9406"/>
             <w:shd w:val="clear" w:color="auto" w:fill="1A3C5E"/>
           </w:tcPr>
           <w:p>
             <w:pPr>
-              <w:spacing w:before="240" w:after="240"/>
+              <w:spacing w:before="280" w:after="280"/>
               <w:jc w:val="center"/>
             </w:pPr>
             <w:r>
@@ -90,7 +90,7 @@
                 <w:rFonts w:ascii="Arial" w:hAnsi="Arial"/>
                 <w:sz w:val="18"/>
               </w:rPr>
-              <w:t>Talezzi.com — Plateforme ebooks enfants multilingue</w:t>
+              <w:t>Talezzi.com — Plateforme ebooks enfants multilingue (10 langues)</w:t>
             </w:r>
           </w:p>
         </w:tc>
@@ -240,7 +240,7 @@
                 <w:rFonts w:ascii="Arial" w:hAnsi="Arial"/>
                 <w:sz w:val="18"/>
               </w:rPr>
-              <w:t>🟡 À approfondir — Quick Screen validé</w:t>
+              <w:t>Quick Screen validé — À approfondir</w:t>
             </w:r>
           </w:p>
         </w:tc>
@@ -249,31 +249,33 @@
     <w:p/>
     <w:p>
       <w:pPr>
-        <w:spacing w:before="80" w:after="240"/>
+        <w:spacing w:after="240"/>
       </w:pPr>
       <w:r>
         <w:rPr>
+          <w:rFonts w:ascii="Arial" w:hAnsi="Arial"/>
           <w:i/>
           <w:color w:val="444444"/>
           <w:sz w:val="20"/>
         </w:rPr>
-        <w:t>Ce document vous est partagé dans le cadre de notre processus de due diligence. Vos réponses nous aideront à avancer rapidement. Il n'y a pas de bonne ou mauvaise réponse — nous cherchons avant tout à comprendre le projet tel qu'il est.</w:t>
+        <w:t>Ce document vous est partagé dans le cadre de notre processus de due diligence. Nous avons pris le temps de lire votre listing en détail et ces questions reflètent ce que nous devons comprendre pour avancer sérieusement. Il n'y a pas de bonne ou mauvaise réponse — nous cherchons avant tout à comprendre le projet tel qu'il est, pas tel qu'il pourrait être présenté.</w:t>
       </w:r>
     </w:p>
     <w:p>
       <w:pPr>
-        <w:spacing w:before="320" w:after="120"/>
+        <w:spacing w:before="360" w:after="80"/>
         <w:pBdr>
           <w:bottom w:val="single" w:sz="6" w:space="1" w:color="1A3C5E"/>
         </w:pBdr>
       </w:pPr>
       <w:r>
         <w:rPr>
+          <w:rFonts w:ascii="Arial" w:hAnsi="Arial"/>
           <w:b/>
           <w:color w:val="1A3C5E"/>
-          <w:sz w:val="28"/>
+          <w:sz w:val="24"/>
         </w:rPr>
-        <w:t>A — Questions générales (tous deals)</w:t>
+        <w:t>A — Questions générales</w:t>
       </w:r>
     </w:p>
     <w:p>
@@ -282,6 +284,7 @@
       </w:pPr>
       <w:r>
         <w:rPr>
+          <w:rFonts w:ascii="Arial" w:hAnsi="Arial"/>
           <w:b/>
           <w:color w:val="1A3C5E"/>
           <w:sz w:val="20"/>
@@ -290,11 +293,12 @@
       </w:r>
       <w:r>
         <w:rPr>
+          <w:rFonts w:ascii="Arial" w:hAnsi="Arial"/>
           <w:b/>
           <w:color w:val="1A1A1A"/>
           <w:sz w:val="20"/>
         </w:rPr>
-        <w:t>Pouvez-vous vous présenter brièvement ? Quel est votre parcours avec ce projet ?</w:t>
+        <w:t>Pouvez-vous vous présenter brièvement ? Quel est votre parcours avec ce projet, depuis l'idée initiale jusqu'à aujourd'hui ?</w:t>
       </w:r>
     </w:p>
     <w:tbl>
@@ -324,6 +328,7 @@
             </w:pPr>
             <w:r>
               <w:rPr>
+                <w:rFonts w:ascii="Arial" w:hAnsi="Arial"/>
                 <w:i/>
                 <w:color w:val="BBBBBB"/>
                 <w:sz w:val="20"/>
@@ -361,6 +366,7 @@
       </w:pPr>
       <w:r>
         <w:rPr>
+          <w:rFonts w:ascii="Arial" w:hAnsi="Arial"/>
           <w:b/>
           <w:color w:val="1A3C5E"/>
           <w:sz w:val="20"/>
@@ -369,11 +375,26 @@
       </w:r>
       <w:r>
         <w:rPr>
+          <w:rFonts w:ascii="Arial" w:hAnsi="Arial"/>
           <w:b/>
           <w:color w:val="1A1A1A"/>
           <w:sz w:val="20"/>
         </w:rPr>
         <w:t>Quelle est la raison principale de la mise en vente aujourd'hui ?</w:t>
+      </w:r>
+    </w:p>
+    <w:p>
+      <w:pPr>
+        <w:spacing w:before="40" w:after="40"/>
+      </w:pPr>
+      <w:r>
+        <w:rPr>
+          <w:rFonts w:ascii="Arial" w:hAnsi="Arial"/>
+          <w:i/>
+          <w:color w:val="666666"/>
+          <w:sz w:val="18"/>
+        </w:rPr>
+        <w:t xml:space="preserve">  Nous posons cette question à tous les vendeurs — pas de jugement, juste de la transparence.</w:t>
       </w:r>
     </w:p>
     <w:tbl>
@@ -403,6 +424,7 @@
             </w:pPr>
             <w:r>
               <w:rPr>
+                <w:rFonts w:ascii="Arial" w:hAnsi="Arial"/>
                 <w:i/>
                 <w:color w:val="BBBBBB"/>
                 <w:sz w:val="20"/>
@@ -440,6 +462,7 @@
       </w:pPr>
       <w:r>
         <w:rPr>
+          <w:rFonts w:ascii="Arial" w:hAnsi="Arial"/>
           <w:b/>
           <w:color w:val="1A3C5E"/>
           <w:sz w:val="20"/>
@@ -448,11 +471,12 @@
       </w:r>
       <w:r>
         <w:rPr>
+          <w:rFonts w:ascii="Arial" w:hAnsi="Arial"/>
           <w:b/>
           <w:color w:val="1A1A1A"/>
           <w:sz w:val="20"/>
         </w:rPr>
-        <w:t>Tous les actifs listés dans l'annonce (code, domaine, contenus, comptes) sont-ils bien inclus dans la vente ? Y a-t-il des exclusions ?</w:t>
+        <w:t>Tous les actifs listés dans l'annonce (code source, domaine, comptes, contenus, Universe Bible, illustrations) sont-ils bien inclus dans la vente ? Y a-t-il des exclusions dont nous devrions être informés ?</w:t>
       </w:r>
     </w:p>
     <w:tbl>
@@ -482,6 +506,7 @@
             </w:pPr>
             <w:r>
               <w:rPr>
+                <w:rFonts w:ascii="Arial" w:hAnsi="Arial"/>
                 <w:i/>
                 <w:color w:val="BBBBBB"/>
                 <w:sz w:val="20"/>
@@ -514,6 +539,7 @@
       </w:pPr>
       <w:r>
         <w:rPr>
+          <w:rFonts w:ascii="Arial" w:hAnsi="Arial"/>
           <w:b/>
           <w:color w:val="1A3C5E"/>
           <w:sz w:val="20"/>
@@ -522,11 +548,12 @@
       </w:r>
       <w:r>
         <w:rPr>
+          <w:rFonts w:ascii="Arial" w:hAnsi="Arial"/>
           <w:b/>
           <w:color w:val="1A1A1A"/>
           <w:sz w:val="20"/>
         </w:rPr>
-        <w:t>Existe-t-il des dettes, obligations contractuelles, litiges en cours ou engagements tiers liés à ce business dont nous devrions être informés ?</w:t>
+        <w:t>Existe-t-il des dettes, obligations contractuelles, accords de partage de revenus, litiges en cours ou engagements tiers liés à ce projet ?</w:t>
       </w:r>
     </w:p>
     <w:tbl>
@@ -556,6 +583,7 @@
             </w:pPr>
             <w:r>
               <w:rPr>
+                <w:rFonts w:ascii="Arial" w:hAnsi="Arial"/>
                 <w:i/>
                 <w:color w:val="BBBBBB"/>
                 <w:sz w:val="20"/>
@@ -588,6 +616,7 @@
       </w:pPr>
       <w:r>
         <w:rPr>
+          <w:rFonts w:ascii="Arial" w:hAnsi="Arial"/>
           <w:b/>
           <w:color w:val="1A3C5E"/>
           <w:sz w:val="20"/>
@@ -596,11 +625,12 @@
       </w:r>
       <w:r>
         <w:rPr>
+          <w:rFonts w:ascii="Arial" w:hAnsi="Arial"/>
           <w:b/>
           <w:color w:val="1A1A1A"/>
           <w:sz w:val="20"/>
         </w:rPr>
-        <w:t>Êtes-vous disponible pour accompagner la transition après la vente ? Sous quelle forme et sur quelle durée ?</w:t>
+        <w:t>Êtes-vous disponible pour accompagner la transition après la vente ? Sous quelle forme (appels, documentation, accès partagé) et sur quelle durée ?</w:t>
       </w:r>
     </w:p>
     <w:tbl>
@@ -630,6 +660,7 @@
             </w:pPr>
             <w:r>
               <w:rPr>
+                <w:rFonts w:ascii="Arial" w:hAnsi="Arial"/>
                 <w:i/>
                 <w:color w:val="BBBBBB"/>
                 <w:sz w:val="20"/>
@@ -658,44 +689,47 @@
     <w:p/>
     <w:p>
       <w:pPr>
-        <w:spacing w:before="320" w:after="120"/>
+        <w:spacing w:before="360" w:after="80"/>
         <w:pBdr>
           <w:bottom w:val="single" w:sz="6" w:space="1" w:color="1A3C5E"/>
         </w:pBdr>
       </w:pPr>
       <w:r>
         <w:rPr>
+          <w:rFonts w:ascii="Arial" w:hAnsi="Arial"/>
           <w:b/>
           <w:color w:val="1A3C5E"/>
-          <w:sz w:val="28"/>
+          <w:sz w:val="24"/>
         </w:rPr>
         <w:t>B — Questions spécifiques à Talezzi.com</w:t>
       </w:r>
     </w:p>
     <w:p>
       <w:pPr>
-        <w:spacing w:after="160"/>
+        <w:spacing w:after="120"/>
       </w:pPr>
       <w:r>
         <w:rPr>
+          <w:rFonts w:ascii="Arial" w:hAnsi="Arial"/>
           <w:i/>
           <w:color w:val="444444"/>
           <w:sz w:val="20"/>
         </w:rPr>
-        <w:t>Ces questions portent sur les aspects qui nous semblent déterminants pour évaluer la valeur réelle de l'actif et la faisabilité de la reprise.</w:t>
+        <w:t>Ces questions portent sur les trois aspects qui conditionnent notre décision : la solidité de la fondation narrative, la nature de la production de contenu, et la propreté des droits de propriété intellectuelle.</w:t>
       </w:r>
     </w:p>
     <w:p>
       <w:pPr>
-        <w:spacing w:before="200" w:after="120"/>
+        <w:spacing w:before="280" w:after="40"/>
       </w:pPr>
       <w:r>
         <w:rPr>
+          <w:rFonts w:ascii="Arial" w:hAnsi="Arial"/>
           <w:b/>
           <w:color w:val="2E6DA4"/>
-          <w:sz w:val="22"/>
+          <w:sz w:val="20"/>
         </w:rPr>
-        <w:t>B1 — L'Universe Bible et le workflow de production</w:t>
+        <w:t>B1 — Universe Bible et production de contenu</w:t>
       </w:r>
     </w:p>
     <w:p>
@@ -704,6 +738,7 @@
       </w:pPr>
       <w:r>
         <w:rPr>
+          <w:rFonts w:ascii="Arial" w:hAnsi="Arial"/>
           <w:b/>
           <w:color w:val="1A3C5E"/>
           <w:sz w:val="20"/>
@@ -712,11 +747,26 @@
       </w:r>
       <w:r>
         <w:rPr>
+          <w:rFonts w:ascii="Arial" w:hAnsi="Arial"/>
           <w:b/>
           <w:color w:val="1A1A1A"/>
           <w:sz w:val="20"/>
         </w:rPr>
-        <w:t>Pouvez-vous décrire concrètement la structure de l'Universe Bible ? Qu'est-ce qu'elle contient (personnages, univers, règles narratives, etc.) et comment est-elle organisée ?</w:t>
+        <w:t>Pouvez-vous décrire la structure de l'Universe Bible ? Qu'est-ce qu'elle contient concrètement — règles narratives, personnages, univers, contraintes de ton — et comment est-elle organisée ?</w:t>
+      </w:r>
+    </w:p>
+    <w:p>
+      <w:pPr>
+        <w:spacing w:before="40" w:after="40"/>
+      </w:pPr>
+      <w:r>
+        <w:rPr>
+          <w:rFonts w:ascii="Arial" w:hAnsi="Arial"/>
+          <w:i/>
+          <w:color w:val="666666"/>
+          <w:sz w:val="18"/>
+        </w:rPr>
+        <w:t xml:space="preserve">  Nous cherchons à comprendre si elle peut guider la création de nouvelles histoires de manière autonome, ou si elle suppose une connaissance implicite de votre part.</w:t>
       </w:r>
     </w:p>
     <w:tbl>
@@ -746,6 +796,354 @@
             </w:pPr>
             <w:r>
               <w:rPr>
+                <w:rFonts w:ascii="Arial" w:hAnsi="Arial"/>
+                <w:i/>
+                <w:color w:val="BBBBBB"/>
+                <w:sz w:val="20"/>
+              </w:rPr>
+              <w:t>Votre réponse...</w:t>
+            </w:r>
+          </w:p>
+          <w:p>
+            <w:pPr>
+              <w:spacing w:before="0" w:after="0"/>
+            </w:pPr>
+          </w:p>
+          <w:p>
+            <w:pPr>
+              <w:spacing w:before="0" w:after="0"/>
+            </w:pPr>
+          </w:p>
+          <w:p>
+            <w:pPr>
+              <w:spacing w:before="0" w:after="0"/>
+            </w:pPr>
+          </w:p>
+          <w:p>
+            <w:pPr>
+              <w:spacing w:before="0" w:after="0"/>
+            </w:pPr>
+          </w:p>
+          <w:p>
+            <w:pPr>
+              <w:spacing w:before="0" w:after="0"/>
+            </w:pPr>
+          </w:p>
+          <w:p>
+            <w:pPr>
+              <w:spacing w:before="0" w:after="0"/>
+            </w:pPr>
+          </w:p>
+          <w:p>
+            <w:pPr>
+              <w:spacing w:before="0" w:after="0"/>
+            </w:pPr>
+          </w:p>
+        </w:tc>
+      </w:tr>
+    </w:tbl>
+    <w:p/>
+    <w:p>
+      <w:pPr>
+        <w:spacing w:before="200" w:after="40"/>
+      </w:pPr>
+      <w:r>
+        <w:rPr>
+          <w:rFonts w:ascii="Arial" w:hAnsi="Arial"/>
+          <w:b/>
+          <w:color w:val="1A3C5E"/>
+          <w:sz w:val="20"/>
+        </w:rPr>
+        <w:t xml:space="preserve">Q7. </w:t>
+      </w:r>
+      <w:r>
+        <w:rPr>
+          <w:rFonts w:ascii="Arial" w:hAnsi="Arial"/>
+          <w:b/>
+          <w:color w:val="1A1A1A"/>
+          <w:sz w:val="20"/>
+        </w:rPr>
+        <w:t>Quel est le workflow complet de production d'une nouvelle histoire : de l'idée initiale jusqu'à la publication sur la plateforme, en passant par la traduction et l'intégration ? Qui fait quoi, et combien de temps chaque étape prend-elle ?</w:t>
+      </w:r>
+    </w:p>
+    <w:p>
+      <w:pPr>
+        <w:spacing w:before="40" w:after="40"/>
+      </w:pPr>
+      <w:r>
+        <w:rPr>
+          <w:rFonts w:ascii="Arial" w:hAnsi="Arial"/>
+          <w:i/>
+          <w:color w:val="666666"/>
+          <w:sz w:val="18"/>
+        </w:rPr>
+        <w:t xml:space="preserve">  Détaillez autant que possible — nous voulons comprendre ce qui est manuel, ce qui est outillé, et ce qui pourrait être délégué.</w:t>
+      </w:r>
+    </w:p>
+    <w:tbl>
+      <w:tblPr>
+        <w:tblStyle w:val="TableGrid"/>
+        <w:tblW w:type="auto" w:w="0"/>
+        <w:tblLook w:firstColumn="1" w:firstRow="1" w:lastColumn="0" w:lastRow="0" w:noHBand="0" w:noVBand="1" w:val="04A0"/>
+      </w:tblPr>
+      <w:tblGrid>
+        <w:gridCol w:w="9406"/>
+      </w:tblGrid>
+      <w:tr>
+        <w:tc>
+          <w:tcPr>
+            <w:tcW w:type="dxa" w:w="9072"/>
+            <w:shd w:val="clear" w:color="auto" w:fill="F5F8FB"/>
+            <w:tcBorders>
+              <w:top w:val="single" w:sz="4" w:space="0" w:color="C5D5E8"/>
+              <w:left w:val="single" w:sz="4" w:space="0" w:color="C5D5E8"/>
+              <w:bottom w:val="single" w:sz="4" w:space="0" w:color="C5D5E8"/>
+              <w:right w:val="single" w:sz="4" w:space="0" w:color="C5D5E8"/>
+            </w:tcBorders>
+          </w:tcPr>
+          <w:p>
+            <w:pPr>
+              <w:spacing w:before="80" w:after="80"/>
+            </w:pPr>
+            <w:r>
+              <w:rPr>
+                <w:rFonts w:ascii="Arial" w:hAnsi="Arial"/>
+                <w:i/>
+                <w:color w:val="BBBBBB"/>
+                <w:sz w:val="20"/>
+              </w:rPr>
+              <w:t>Votre réponse...</w:t>
+            </w:r>
+          </w:p>
+          <w:p>
+            <w:pPr>
+              <w:spacing w:before="0" w:after="0"/>
+            </w:pPr>
+          </w:p>
+          <w:p>
+            <w:pPr>
+              <w:spacing w:before="0" w:after="0"/>
+            </w:pPr>
+          </w:p>
+          <w:p>
+            <w:pPr>
+              <w:spacing w:before="0" w:after="0"/>
+            </w:pPr>
+          </w:p>
+          <w:p>
+            <w:pPr>
+              <w:spacing w:before="0" w:after="0"/>
+            </w:pPr>
+          </w:p>
+          <w:p>
+            <w:pPr>
+              <w:spacing w:before="0" w:after="0"/>
+            </w:pPr>
+          </w:p>
+          <w:p>
+            <w:pPr>
+              <w:spacing w:before="0" w:after="0"/>
+            </w:pPr>
+          </w:p>
+          <w:p>
+            <w:pPr>
+              <w:spacing w:before="0" w:after="0"/>
+            </w:pPr>
+          </w:p>
+          <w:p>
+            <w:pPr>
+              <w:spacing w:before="0" w:after="0"/>
+            </w:pPr>
+          </w:p>
+        </w:tc>
+      </w:tr>
+    </w:tbl>
+    <w:p/>
+    <w:p>
+      <w:pPr>
+        <w:spacing w:before="200" w:after="40"/>
+      </w:pPr>
+      <w:r>
+        <w:rPr>
+          <w:rFonts w:ascii="Arial" w:hAnsi="Arial"/>
+          <w:b/>
+          <w:color w:val="1A3C5E"/>
+          <w:sz w:val="20"/>
+        </w:rPr>
+        <w:t xml:space="preserve">Q8. </w:t>
+      </w:r>
+      <w:r>
+        <w:rPr>
+          <w:rFonts w:ascii="Arial" w:hAnsi="Arial"/>
+          <w:b/>
+          <w:color w:val="1A1A1A"/>
+          <w:sz w:val="20"/>
+        </w:rPr>
+        <w:t>Des outils d'intelligence artificielle ont-ils été utilisés dans la création des histoires, des traductions ou des illustrations ? Si oui, lesquels, à quelle étape, et sous quelles conditions d'utilisation ?</w:t>
+      </w:r>
+    </w:p>
+    <w:p>
+      <w:pPr>
+        <w:spacing w:before="40" w:after="40"/>
+      </w:pPr>
+      <w:r>
+        <w:rPr>
+          <w:rFonts w:ascii="Arial" w:hAnsi="Arial"/>
+          <w:i/>
+          <w:color w:val="666666"/>
+          <w:sz w:val="18"/>
+        </w:rPr>
+        <w:t xml:space="preserve">  Cette question est importante pour évaluer la reproductibilité du processus et la conformité des droits d'utilisation commerciale.</w:t>
+      </w:r>
+    </w:p>
+    <w:tbl>
+      <w:tblPr>
+        <w:tblStyle w:val="TableGrid"/>
+        <w:tblW w:type="auto" w:w="0"/>
+        <w:tblLook w:firstColumn="1" w:firstRow="1" w:lastColumn="0" w:lastRow="0" w:noHBand="0" w:noVBand="1" w:val="04A0"/>
+      </w:tblPr>
+      <w:tblGrid>
+        <w:gridCol w:w="9406"/>
+      </w:tblGrid>
+      <w:tr>
+        <w:tc>
+          <w:tcPr>
+            <w:tcW w:type="dxa" w:w="9072"/>
+            <w:shd w:val="clear" w:color="auto" w:fill="F5F8FB"/>
+            <w:tcBorders>
+              <w:top w:val="single" w:sz="4" w:space="0" w:color="C5D5E8"/>
+              <w:left w:val="single" w:sz="4" w:space="0" w:color="C5D5E8"/>
+              <w:bottom w:val="single" w:sz="4" w:space="0" w:color="C5D5E8"/>
+              <w:right w:val="single" w:sz="4" w:space="0" w:color="C5D5E8"/>
+            </w:tcBorders>
+          </w:tcPr>
+          <w:p>
+            <w:pPr>
+              <w:spacing w:before="80" w:after="80"/>
+            </w:pPr>
+            <w:r>
+              <w:rPr>
+                <w:rFonts w:ascii="Arial" w:hAnsi="Arial"/>
+                <w:i/>
+                <w:color w:val="BBBBBB"/>
+                <w:sz w:val="20"/>
+              </w:rPr>
+              <w:t>Votre réponse...</w:t>
+            </w:r>
+          </w:p>
+          <w:p>
+            <w:pPr>
+              <w:spacing w:before="0" w:after="0"/>
+            </w:pPr>
+          </w:p>
+          <w:p>
+            <w:pPr>
+              <w:spacing w:before="0" w:after="0"/>
+            </w:pPr>
+          </w:p>
+          <w:p>
+            <w:pPr>
+              <w:spacing w:before="0" w:after="0"/>
+            </w:pPr>
+          </w:p>
+          <w:p>
+            <w:pPr>
+              <w:spacing w:before="0" w:after="0"/>
+            </w:pPr>
+          </w:p>
+          <w:p>
+            <w:pPr>
+              <w:spacing w:before="0" w:after="0"/>
+            </w:pPr>
+          </w:p>
+          <w:p>
+            <w:pPr>
+              <w:spacing w:before="0" w:after="0"/>
+            </w:pPr>
+          </w:p>
+        </w:tc>
+      </w:tr>
+    </w:tbl>
+    <w:p/>
+    <w:p>
+      <w:pPr>
+        <w:spacing w:before="280" w:after="40"/>
+      </w:pPr>
+      <w:r>
+        <w:rPr>
+          <w:rFonts w:ascii="Arial" w:hAnsi="Arial"/>
+          <w:b/>
+          <w:color w:val="2E6DA4"/>
+          <w:sz w:val="20"/>
+        </w:rPr>
+        <w:t>B2 — Propriété intellectuelle et droits d'exploitation</w:t>
+      </w:r>
+    </w:p>
+    <w:p>
+      <w:pPr>
+        <w:spacing w:before="200" w:after="40"/>
+      </w:pPr>
+      <w:r>
+        <w:rPr>
+          <w:rFonts w:ascii="Arial" w:hAnsi="Arial"/>
+          <w:b/>
+          <w:color w:val="1A3C5E"/>
+          <w:sz w:val="20"/>
+        </w:rPr>
+        <w:t xml:space="preserve">Q9. </w:t>
+      </w:r>
+      <w:r>
+        <w:rPr>
+          <w:rFonts w:ascii="Arial" w:hAnsi="Arial"/>
+          <w:b/>
+          <w:color w:val="1A1A1A"/>
+          <w:sz w:val="20"/>
+        </w:rPr>
+        <w:t>Qui a créé les histoires, les illustrations et les contenus inclus dans la vente ? Disposez-vous de documents attestant la cession de ces droits (contrats, factures avec mention de cession, conditions d'utilisation des outils IA) ?</w:t>
+      </w:r>
+    </w:p>
+    <w:p>
+      <w:pPr>
+        <w:spacing w:before="40" w:after="40"/>
+      </w:pPr>
+      <w:r>
+        <w:rPr>
+          <w:rFonts w:ascii="Arial" w:hAnsi="Arial"/>
+          <w:i/>
+          <w:color w:val="666666"/>
+          <w:sz w:val="18"/>
+        </w:rPr>
+        <w:t xml:space="preserve">  Nous avons besoin de cette clarté pour évaluer les possibilités d'exploitation sur différents canaux et formats.</w:t>
+      </w:r>
+    </w:p>
+    <w:tbl>
+      <w:tblPr>
+        <w:tblStyle w:val="TableGrid"/>
+        <w:tblW w:type="auto" w:w="0"/>
+        <w:tblLook w:firstColumn="1" w:firstRow="1" w:lastColumn="0" w:lastRow="0" w:noHBand="0" w:noVBand="1" w:val="04A0"/>
+      </w:tblPr>
+      <w:tblGrid>
+        <w:gridCol w:w="9406"/>
+      </w:tblGrid>
+      <w:tr>
+        <w:tc>
+          <w:tcPr>
+            <w:tcW w:type="dxa" w:w="9072"/>
+            <w:shd w:val="clear" w:color="auto" w:fill="F5F8FB"/>
+            <w:tcBorders>
+              <w:top w:val="single" w:sz="4" w:space="0" w:color="C5D5E8"/>
+              <w:left w:val="single" w:sz="4" w:space="0" w:color="C5D5E8"/>
+              <w:bottom w:val="single" w:sz="4" w:space="0" w:color="C5D5E8"/>
+              <w:right w:val="single" w:sz="4" w:space="0" w:color="C5D5E8"/>
+            </w:tcBorders>
+          </w:tcPr>
+          <w:p>
+            <w:pPr>
+              <w:spacing w:before="80" w:after="80"/>
+            </w:pPr>
+            <w:r>
+              <w:rPr>
+                <w:rFonts w:ascii="Arial" w:hAnsi="Arial"/>
                 <w:i/>
                 <w:color w:val="BBBBBB"/>
                 <w:sz w:val="20"/>
@@ -793,19 +1191,21 @@
       </w:pPr>
       <w:r>
         <w:rPr>
+          <w:rFonts w:ascii="Arial" w:hAnsi="Arial"/>
           <w:b/>
           <w:color w:val="1A3C5E"/>
           <w:sz w:val="20"/>
         </w:rPr>
-        <w:t xml:space="preserve">Q7. </w:t>
+        <w:t xml:space="preserve">Q10. </w:t>
       </w:r>
       <w:r>
         <w:rPr>
+          <w:rFonts w:ascii="Arial" w:hAnsi="Arial"/>
           <w:b/>
           <w:color w:val="1A1A1A"/>
           <w:sz w:val="20"/>
         </w:rPr>
-        <w:t>Quel est le workflow complet de production d'une nouvelle histoire, de l'idée initiale jusqu'à la publication sur la plateforme ? Combien de temps cela prend-il typiquement ?</w:t>
+        <w:t>Le nom 'Talezzi', le logo et l'identité visuelle ont-ils fait l'objet d'un dépôt de marque ou d'une vérification de disponibilité ? Êtes-vous en mesure de céder l'ensemble de ces éléments sans restriction ?</w:t>
       </w:r>
     </w:p>
     <w:tbl>
@@ -835,276 +1235,7 @@
             </w:pPr>
             <w:r>
               <w:rPr>
-                <w:i/>
-                <w:color w:val="BBBBBB"/>
-                <w:sz w:val="20"/>
-              </w:rPr>
-              <w:t>Votre réponse...</w:t>
-            </w:r>
-          </w:p>
-          <w:p>
-            <w:pPr>
-              <w:spacing w:before="0" w:after="0"/>
-            </w:pPr>
-          </w:p>
-          <w:p>
-            <w:pPr>
-              <w:spacing w:before="0" w:after="0"/>
-            </w:pPr>
-          </w:p>
-          <w:p>
-            <w:pPr>
-              <w:spacing w:before="0" w:after="0"/>
-            </w:pPr>
-          </w:p>
-          <w:p>
-            <w:pPr>
-              <w:spacing w:before="0" w:after="0"/>
-            </w:pPr>
-          </w:p>
-          <w:p>
-            <w:pPr>
-              <w:spacing w:before="0" w:after="0"/>
-            </w:pPr>
-          </w:p>
-          <w:p>
-            <w:pPr>
-              <w:spacing w:before="0" w:after="0"/>
-            </w:pPr>
-          </w:p>
-        </w:tc>
-      </w:tr>
-    </w:tbl>
-    <w:p/>
-    <w:p>
-      <w:pPr>
-        <w:spacing w:before="200" w:after="40"/>
-      </w:pPr>
-      <w:r>
-        <w:rPr>
-          <w:b/>
-          <w:color w:val="1A3C5E"/>
-          <w:sz w:val="20"/>
-        </w:rPr>
-        <w:t xml:space="preserve">Q8. </w:t>
-      </w:r>
-      <w:r>
-        <w:rPr>
-          <w:b/>
-          <w:color w:val="1A1A1A"/>
-          <w:sz w:val="20"/>
-        </w:rPr>
-        <w:t>Les 3 histoires existantes et leurs traductions en 10 langues ont-elles été rédigées par vous, par des prestataires, ou générées (partiellement ou entièrement) par des outils IA ? Si IA, quel outil et dans quel cadre d'utilisation ?</w:t>
-      </w:r>
-    </w:p>
-    <w:tbl>
-      <w:tblPr>
-        <w:tblStyle w:val="TableGrid"/>
-        <w:tblW w:type="auto" w:w="0"/>
-        <w:tblLook w:firstColumn="1" w:firstRow="1" w:lastColumn="0" w:lastRow="0" w:noHBand="0" w:noVBand="1" w:val="04A0"/>
-      </w:tblPr>
-      <w:tblGrid>
-        <w:gridCol w:w="9406"/>
-      </w:tblGrid>
-      <w:tr>
-        <w:tc>
-          <w:tcPr>
-            <w:tcW w:type="dxa" w:w="9072"/>
-            <w:shd w:val="clear" w:color="auto" w:fill="F5F8FB"/>
-            <w:tcBorders>
-              <w:top w:val="single" w:sz="4" w:space="0" w:color="C5D5E8"/>
-              <w:left w:val="single" w:sz="4" w:space="0" w:color="C5D5E8"/>
-              <w:bottom w:val="single" w:sz="4" w:space="0" w:color="C5D5E8"/>
-              <w:right w:val="single" w:sz="4" w:space="0" w:color="C5D5E8"/>
-            </w:tcBorders>
-          </w:tcPr>
-          <w:p>
-            <w:pPr>
-              <w:spacing w:before="80" w:after="80"/>
-            </w:pPr>
-            <w:r>
-              <w:rPr>
-                <w:i/>
-                <w:color w:val="BBBBBB"/>
-                <w:sz w:val="20"/>
-              </w:rPr>
-              <w:t>Votre réponse...</w:t>
-            </w:r>
-          </w:p>
-          <w:p>
-            <w:pPr>
-              <w:spacing w:before="0" w:after="0"/>
-            </w:pPr>
-          </w:p>
-          <w:p>
-            <w:pPr>
-              <w:spacing w:before="0" w:after="0"/>
-            </w:pPr>
-          </w:p>
-          <w:p>
-            <w:pPr>
-              <w:spacing w:before="0" w:after="0"/>
-            </w:pPr>
-          </w:p>
-          <w:p>
-            <w:pPr>
-              <w:spacing w:before="0" w:after="0"/>
-            </w:pPr>
-          </w:p>
-          <w:p>
-            <w:pPr>
-              <w:spacing w:before="0" w:after="0"/>
-            </w:pPr>
-          </w:p>
-        </w:tc>
-      </w:tr>
-    </w:tbl>
-    <w:p/>
-    <w:p>
-      <w:pPr>
-        <w:spacing w:before="200" w:after="120"/>
-      </w:pPr>
-      <w:r>
-        <w:rPr>
-          <w:b/>
-          <w:color w:val="2E6DA4"/>
-          <w:sz w:val="22"/>
-        </w:rPr>
-        <w:t>B2 — Droits de propriété intellectuelle</w:t>
-      </w:r>
-    </w:p>
-    <w:p>
-      <w:pPr>
-        <w:spacing w:before="200" w:after="40"/>
-      </w:pPr>
-      <w:r>
-        <w:rPr>
-          <w:b/>
-          <w:color w:val="1A3C5E"/>
-          <w:sz w:val="20"/>
-        </w:rPr>
-        <w:t xml:space="preserve">Q9. </w:t>
-      </w:r>
-      <w:r>
-        <w:rPr>
-          <w:b/>
-          <w:color w:val="1A1A1A"/>
-          <w:sz w:val="20"/>
-        </w:rPr>
-        <w:t>Disposez-vous de l'intégralité des droits sur les histoires, illustrations et autres contenus créatifs inclus dans la vente ? Ces droits sont-ils documentés par écrit (contrats de cession, factures, etc.) ?</w:t>
-      </w:r>
-    </w:p>
-    <w:tbl>
-      <w:tblPr>
-        <w:tblStyle w:val="TableGrid"/>
-        <w:tblW w:type="auto" w:w="0"/>
-        <w:tblLook w:firstColumn="1" w:firstRow="1" w:lastColumn="0" w:lastRow="0" w:noHBand="0" w:noVBand="1" w:val="04A0"/>
-      </w:tblPr>
-      <w:tblGrid>
-        <w:gridCol w:w="9406"/>
-      </w:tblGrid>
-      <w:tr>
-        <w:tc>
-          <w:tcPr>
-            <w:tcW w:type="dxa" w:w="9072"/>
-            <w:shd w:val="clear" w:color="auto" w:fill="F5F8FB"/>
-            <w:tcBorders>
-              <w:top w:val="single" w:sz="4" w:space="0" w:color="C5D5E8"/>
-              <w:left w:val="single" w:sz="4" w:space="0" w:color="C5D5E8"/>
-              <w:bottom w:val="single" w:sz="4" w:space="0" w:color="C5D5E8"/>
-              <w:right w:val="single" w:sz="4" w:space="0" w:color="C5D5E8"/>
-            </w:tcBorders>
-          </w:tcPr>
-          <w:p>
-            <w:pPr>
-              <w:spacing w:before="80" w:after="80"/>
-            </w:pPr>
-            <w:r>
-              <w:rPr>
-                <w:i/>
-                <w:color w:val="BBBBBB"/>
-                <w:sz w:val="20"/>
-              </w:rPr>
-              <w:t>Votre réponse...</w:t>
-            </w:r>
-          </w:p>
-          <w:p>
-            <w:pPr>
-              <w:spacing w:before="0" w:after="0"/>
-            </w:pPr>
-          </w:p>
-          <w:p>
-            <w:pPr>
-              <w:spacing w:before="0" w:after="0"/>
-            </w:pPr>
-          </w:p>
-          <w:p>
-            <w:pPr>
-              <w:spacing w:before="0" w:after="0"/>
-            </w:pPr>
-          </w:p>
-          <w:p>
-            <w:pPr>
-              <w:spacing w:before="0" w:after="0"/>
-            </w:pPr>
-          </w:p>
-          <w:p>
-            <w:pPr>
-              <w:spacing w:before="0" w:after="0"/>
-            </w:pPr>
-          </w:p>
-        </w:tc>
-      </w:tr>
-    </w:tbl>
-    <w:p/>
-    <w:p>
-      <w:pPr>
-        <w:spacing w:before="200" w:after="40"/>
-      </w:pPr>
-      <w:r>
-        <w:rPr>
-          <w:b/>
-          <w:color w:val="1A3C5E"/>
-          <w:sz w:val="20"/>
-        </w:rPr>
-        <w:t xml:space="preserve">Q10. </w:t>
-      </w:r>
-      <w:r>
-        <w:rPr>
-          <w:b/>
-          <w:color w:val="1A1A1A"/>
-          <w:sz w:val="20"/>
-        </w:rPr>
-        <w:t>Le nom 'Talezzi', le logo et l'identité visuelle ont-ils fait l'objet d'un dépôt de marque ? Si non, savez-vous s'ils sont libres d'utilisation dans les marchés cibles (UE, UK) ?</w:t>
-      </w:r>
-    </w:p>
-    <w:tbl>
-      <w:tblPr>
-        <w:tblStyle w:val="TableGrid"/>
-        <w:tblW w:type="auto" w:w="0"/>
-        <w:tblLook w:firstColumn="1" w:firstRow="1" w:lastColumn="0" w:lastRow="0" w:noHBand="0" w:noVBand="1" w:val="04A0"/>
-      </w:tblPr>
-      <w:tblGrid>
-        <w:gridCol w:w="9406"/>
-      </w:tblGrid>
-      <w:tr>
-        <w:tc>
-          <w:tcPr>
-            <w:tcW w:type="dxa" w:w="9072"/>
-            <w:shd w:val="clear" w:color="auto" w:fill="F5F8FB"/>
-            <w:tcBorders>
-              <w:top w:val="single" w:sz="4" w:space="0" w:color="C5D5E8"/>
-              <w:left w:val="single" w:sz="4" w:space="0" w:color="C5D5E8"/>
-              <w:bottom w:val="single" w:sz="4" w:space="0" w:color="C5D5E8"/>
-              <w:right w:val="single" w:sz="4" w:space="0" w:color="C5D5E8"/>
-            </w:tcBorders>
-          </w:tcPr>
-          <w:p>
-            <w:pPr>
-              <w:spacing w:before="80" w:after="80"/>
-            </w:pPr>
-            <w:r>
-              <w:rPr>
+                <w:rFonts w:ascii="Arial" w:hAnsi="Arial"/>
                 <w:i/>
                 <w:color w:val="BBBBBB"/>
                 <w:sz w:val="20"/>
@@ -1138,15 +1269,16 @@
     <w:p/>
     <w:p>
       <w:pPr>
-        <w:spacing w:before="200" w:after="120"/>
+        <w:spacing w:before="280" w:after="40"/>
       </w:pPr>
       <w:r>
         <w:rPr>
+          <w:rFonts w:ascii="Arial" w:hAnsi="Arial"/>
           <w:b/>
           <w:color w:val="2E6DA4"/>
-          <w:sz w:val="22"/>
+          <w:sz w:val="20"/>
         </w:rPr>
-        <w:t>B3 — Technique et accès</w:t>
+        <w:t>B3 — Accès technique et infrastructure</w:t>
       </w:r>
     </w:p>
     <w:p>
@@ -1155,6 +1287,7 @@
       </w:pPr>
       <w:r>
         <w:rPr>
+          <w:rFonts w:ascii="Arial" w:hAnsi="Arial"/>
           <w:b/>
           <w:color w:val="1A3C5E"/>
           <w:sz w:val="20"/>
@@ -1163,11 +1296,26 @@
       </w:r>
       <w:r>
         <w:rPr>
+          <w:rFonts w:ascii="Arial" w:hAnsi="Arial"/>
           <w:b/>
           <w:color w:val="1A1A1A"/>
           <w:sz w:val="20"/>
         </w:rPr>
-        <w:t>Pouvez-vous nous donner un accès en lecture au dépôt GitHub privé dans le cadre de la due diligence ? Quelles sont vos conditions pour cela ?</w:t>
+        <w:t>Pouvez-vous nous donner un accès en lecture au dépôt GitHub dans le cadre de la due diligence ? Quelles sont vos conditions pour cela ?</w:t>
+      </w:r>
+    </w:p>
+    <w:p>
+      <w:pPr>
+        <w:spacing w:before="40" w:after="40"/>
+      </w:pPr>
+      <w:r>
+        <w:rPr>
+          <w:rFonts w:ascii="Arial" w:hAnsi="Arial"/>
+          <w:i/>
+          <w:color w:val="666666"/>
+          <w:sz w:val="18"/>
+        </w:rPr>
+        <w:t xml:space="preserve">  Accès en lecture seule, à révoquer après la phase de due diligence si la vente n'aboutit pas.</w:t>
       </w:r>
     </w:p>
     <w:tbl>
@@ -1197,6 +1345,7 @@
             </w:pPr>
             <w:r>
               <w:rPr>
+                <w:rFonts w:ascii="Arial" w:hAnsi="Arial"/>
                 <w:i/>
                 <w:color w:val="BBBBBB"/>
                 <w:sz w:val="20"/>
@@ -1229,6 +1378,7 @@
       </w:pPr>
       <w:r>
         <w:rPr>
+          <w:rFonts w:ascii="Arial" w:hAnsi="Arial"/>
           <w:b/>
           <w:color w:val="1A3C5E"/>
           <w:sz w:val="20"/>
@@ -1237,11 +1387,12 @@
       </w:r>
       <w:r>
         <w:rPr>
+          <w:rFonts w:ascii="Arial" w:hAnsi="Arial"/>
           <w:b/>
           <w:color w:val="1A1A1A"/>
           <w:sz w:val="20"/>
         </w:rPr>
-        <w:t>Stripe est intégré mais non activé. Y a-t-il une raison particulière (technique, légale, timing) ? L'activation est-elle prête à l'emploi ou nécessite-t-elle des développements supplémentaires ?</w:t>
+        <w:t>Stripe est intégré mais non activé. Y a-t-il une raison particulière à cela (technique, légale, calendrier) ? L'activation nécessite-t-elle des développements supplémentaires ou est-elle prête à l'emploi avec de nouvelles clés ?</w:t>
       </w:r>
     </w:p>
     <w:tbl>
@@ -1271,6 +1422,89 @@
             </w:pPr>
             <w:r>
               <w:rPr>
+                <w:rFonts w:ascii="Arial" w:hAnsi="Arial"/>
+                <w:i/>
+                <w:color w:val="BBBBBB"/>
+                <w:sz w:val="20"/>
+              </w:rPr>
+              <w:t>Votre réponse...</w:t>
+            </w:r>
+          </w:p>
+          <w:p>
+            <w:pPr>
+              <w:spacing w:before="0" w:after="0"/>
+            </w:pPr>
+          </w:p>
+          <w:p>
+            <w:pPr>
+              <w:spacing w:before="0" w:after="0"/>
+            </w:pPr>
+          </w:p>
+          <w:p>
+            <w:pPr>
+              <w:spacing w:before="0" w:after="0"/>
+            </w:pPr>
+          </w:p>
+          <w:p>
+            <w:pPr>
+              <w:spacing w:before="0" w:after="0"/>
+            </w:pPr>
+          </w:p>
+        </w:tc>
+      </w:tr>
+    </w:tbl>
+    <w:p/>
+    <w:p>
+      <w:pPr>
+        <w:spacing w:before="200" w:after="40"/>
+      </w:pPr>
+      <w:r>
+        <w:rPr>
+          <w:rFonts w:ascii="Arial" w:hAnsi="Arial"/>
+          <w:b/>
+          <w:color w:val="1A3C5E"/>
+          <w:sz w:val="20"/>
+        </w:rPr>
+        <w:t xml:space="preserve">Q13. </w:t>
+      </w:r>
+      <w:r>
+        <w:rPr>
+          <w:rFonts w:ascii="Arial" w:hAnsi="Arial"/>
+          <w:b/>
+          <w:color w:val="1A1A1A"/>
+          <w:sz w:val="20"/>
+        </w:rPr>
+        <w:t>Quels services tiers sont actuellement actifs (au-delà de l'hébergement Hetzner et Google Workspace) ? Y a-t-il des APIs, licences logicielles ou abonnements liés au domaine ou au projet que nous devrions reprendre ?</w:t>
+      </w:r>
+    </w:p>
+    <w:tbl>
+      <w:tblPr>
+        <w:tblStyle w:val="TableGrid"/>
+        <w:tblW w:type="auto" w:w="0"/>
+        <w:tblLook w:firstColumn="1" w:firstRow="1" w:lastColumn="0" w:lastRow="0" w:noHBand="0" w:noVBand="1" w:val="04A0"/>
+      </w:tblPr>
+      <w:tblGrid>
+        <w:gridCol w:w="9406"/>
+      </w:tblGrid>
+      <w:tr>
+        <w:tc>
+          <w:tcPr>
+            <w:tcW w:type="dxa" w:w="9072"/>
+            <w:shd w:val="clear" w:color="auto" w:fill="F5F8FB"/>
+            <w:tcBorders>
+              <w:top w:val="single" w:sz="4" w:space="0" w:color="C5D5E8"/>
+              <w:left w:val="single" w:sz="4" w:space="0" w:color="C5D5E8"/>
+              <w:bottom w:val="single" w:sz="4" w:space="0" w:color="C5D5E8"/>
+              <w:right w:val="single" w:sz="4" w:space="0" w:color="C5D5E8"/>
+            </w:tcBorders>
+          </w:tcPr>
+          <w:p>
+            <w:pPr>
+              <w:spacing w:before="80" w:after="80"/>
+            </w:pPr>
+            <w:r>
+              <w:rPr>
+                <w:rFonts w:ascii="Arial" w:hAnsi="Arial"/>
                 <w:i/>
                 <w:color w:val="BBBBBB"/>
                 <w:sz w:val="20"/>
@@ -1305,14 +1539,20 @@
     <w:p/>
     <w:p>
       <w:pPr>
-        <w:spacing w:before="320"/>
+        <w:spacing w:before="0" w:after="0"/>
+        <w:pBdr>
+          <w:bottom w:val="single" w:sz="6" w:space="1" w:color="C5D5E8"/>
+        </w:pBdr>
+      </w:pPr>
+    </w:p>
+    <w:p>
+      <w:pPr>
+        <w:spacing w:before="160"/>
         <w:jc w:val="center"/>
-        <w:pBdr>
-          <w:top w:val="single" w:sz="4" w:space="1" w:color="C5D5E8"/>
-        </w:pBdr>
       </w:pPr>
       <w:r>
         <w:rPr>
+          <w:rFonts w:ascii="Arial" w:hAnsi="Arial"/>
           <w:i/>
           <w:color w:val="888888"/>
           <w:sz w:val="16"/>

</xml_diff>

<commit_message>
vault backup: 2026-05-21 22:36:59
</commit_message>
<xml_diff>
--- a/notes/talezzi-questionnaire-vendeur.docx
+++ b/notes/talezzi-questionnaire-vendeur.docx
@@ -28,7 +28,7 @@
                 <w:color w:val="FFFFFF"/>
                 <w:sz w:val="28"/>
               </w:rPr>
-              <w:t>QUESTIONNAIRE DE DUE DILIGENCE VENDEUR</w:t>
+              <w:t>VENDOR DUE DILIGENCE QUESTIONNAIRE</w:t>
             </w:r>
           </w:p>
         </w:tc>
@@ -90,7 +90,7 @@
                 <w:rFonts w:ascii="Arial" w:hAnsi="Arial"/>
                 <w:sz w:val="18"/>
               </w:rPr>
-              <w:t>Talezzi.com — Plateforme ebooks enfants multilingue (10 langues)</w:t>
+              <w:t>Talezzi.com — Multilingual children's ebook platform (10 languages)</w:t>
             </w:r>
           </w:p>
         </w:tc>
@@ -190,7 +190,7 @@
                 <w:rFonts w:ascii="Arial" w:hAnsi="Arial"/>
                 <w:sz w:val="18"/>
               </w:rPr>
-              <w:t>16 mai 2026</w:t>
+              <w:t>May 2026</w:t>
             </w:r>
           </w:p>
         </w:tc>
@@ -217,7 +217,7 @@
                 <w:b/>
                 <w:sz w:val="18"/>
               </w:rPr>
-              <w:t>Statut</w:t>
+              <w:t>Status</w:t>
             </w:r>
           </w:p>
         </w:tc>
@@ -240,7 +240,7 @@
                 <w:rFonts w:ascii="Arial" w:hAnsi="Arial"/>
                 <w:sz w:val="18"/>
               </w:rPr>
-              <w:t>Quick Screen validé — À approfondir</w:t>
+              <w:t>Quick Screen passed — Moving to due diligence</w:t>
             </w:r>
           </w:p>
         </w:tc>
@@ -258,7 +258,7 @@
           <w:color w:val="444444"/>
           <w:sz w:val="20"/>
         </w:rPr>
-        <w:t>Ce document vous est partagé dans le cadre de notre processus de due diligence. Nous avons pris le temps de lire votre listing en détail et ces questions reflètent ce que nous devons comprendre pour avancer sérieusement. Il n'y a pas de bonne ou mauvaise réponse — nous cherchons avant tout à comprendre le projet tel qu'il est, pas tel qu'il pourrait être présenté.</w:t>
+        <w:t>Thank you for your detailed initial response — it was genuinely helpful and saved us several rounds of back-and-forth. This document focuses on the remaining open points. Please answer directly in the response boxes below and return the document via Google Drive.</w:t>
       </w:r>
     </w:p>
     <w:p>
@@ -275,7 +275,7 @@
           <w:color w:val="1A3C5E"/>
           <w:sz w:val="24"/>
         </w:rPr>
-        <w:t>A — Questions générales</w:t>
+        <w:t>A — General</w:t>
       </w:r>
     </w:p>
     <w:p>
@@ -298,7 +298,21 @@
           <w:color w:val="1A1A1A"/>
           <w:sz w:val="20"/>
         </w:rPr>
-        <w:t>Pouvez-vous vous présenter brièvement ? Quel est votre parcours avec ce projet, depuis l'idée initiale jusqu'à aujourd'hui ?</w:t>
+        <w:t>What is the main reason you're selling Talezzi at this point?</w:t>
+      </w:r>
+    </w:p>
+    <w:p>
+      <w:pPr>
+        <w:spacing w:before="40" w:after="40"/>
+      </w:pPr>
+      <w:r>
+        <w:rPr>
+          <w:rFonts w:ascii="Arial" w:hAnsi="Arial"/>
+          <w:i/>
+          <w:color w:val="555555"/>
+          <w:sz w:val="18"/>
+        </w:rPr>
+        <w:t xml:space="preserve">  We ask this of every seller — no judgment, just transparency on both sides.</w:t>
       </w:r>
     </w:p>
     <w:tbl>
@@ -333,7 +347,7 @@
                 <w:color w:val="BBBBBB"/>
                 <w:sz w:val="20"/>
               </w:rPr>
-              <w:t>Votre réponse...</w:t>
+              <w:t>Your answer...</w:t>
             </w:r>
           </w:p>
           <w:p>
@@ -380,21 +394,7 @@
           <w:color w:val="1A1A1A"/>
           <w:sz w:val="20"/>
         </w:rPr>
-        <w:t>Quelle est la raison principale de la mise en vente aujourd'hui ?</w:t>
-      </w:r>
-    </w:p>
-    <w:p>
-      <w:pPr>
-        <w:spacing w:before="40" w:after="40"/>
-      </w:pPr>
-      <w:r>
-        <w:rPr>
-          <w:rFonts w:ascii="Arial" w:hAnsi="Arial"/>
-          <w:i/>
-          <w:color w:val="666666"/>
-          <w:sz w:val="18"/>
-        </w:rPr>
-        <w:t xml:space="preserve">  Nous posons cette question à tous les vendeurs — pas de jugement, juste de la transparence.</w:t>
+        <w:t>Can you confirm the complete list of assets included in the sale? Specifically: the domain, the full codebase (including admin dashboard), the Universe Bible, the 3 existing stories in all 10 language versions, the PDF files, all brand assets (name, logo, visual identity), and the Stripe integration. Are there any components that would NOT be included?</w:t>
       </w:r>
     </w:p>
     <w:tbl>
@@ -429,7 +429,7 @@
                 <w:color w:val="BBBBBB"/>
                 <w:sz w:val="20"/>
               </w:rPr>
-              <w:t>Votre réponse...</w:t>
+              <w:t>Your answer...</w:t>
             </w:r>
           </w:p>
           <w:p>
@@ -458,6 +458,23 @@
     <w:p/>
     <w:p>
       <w:pPr>
+        <w:spacing w:before="360" w:after="80"/>
+        <w:pBdr>
+          <w:bottom w:val="single" w:sz="6" w:space="1" w:color="1A3C5E"/>
+        </w:pBdr>
+      </w:pPr>
+      <w:r>
+        <w:rPr>
+          <w:rFonts w:ascii="Arial" w:hAnsi="Arial"/>
+          <w:b/>
+          <w:color w:val="1A3C5E"/>
+          <w:sz w:val="24"/>
+        </w:rPr>
+        <w:t>B — Content &amp; Production (follow-up)</w:t>
+      </w:r>
+    </w:p>
+    <w:p>
+      <w:pPr>
         <w:spacing w:before="200" w:after="40"/>
       </w:pPr>
       <w:r>
@@ -476,7 +493,21 @@
           <w:color w:val="1A1A1A"/>
           <w:sz w:val="20"/>
         </w:rPr>
-        <w:t>Tous les actifs listés dans l'annonce (code source, domaine, comptes, contenus, Universe Bible, illustrations) sont-ils bien inclus dans la vente ? Y a-t-il des exclusions dont nous devrions être informés ?</w:t>
+        <w:t>You mentioned the illustrations are placeholder vector graphics generated programmatically. What tool or process was used to generate them? And to confirm: these placeholder illustrations are included as-is in the sale, with no professional illustration work expected before handover?</w:t>
+      </w:r>
+    </w:p>
+    <w:p>
+      <w:pPr>
+        <w:spacing w:before="40" w:after="40"/>
+      </w:pPr>
+      <w:r>
+        <w:rPr>
+          <w:rFonts w:ascii="Arial" w:hAnsi="Arial"/>
+          <w:i/>
+          <w:color w:val="555555"/>
+          <w:sz w:val="18"/>
+        </w:rPr>
+        <w:t xml:space="preserve">  This helps us understand the current state of the visual assets and plan accordingly.</w:t>
       </w:r>
     </w:p>
     <w:tbl>
@@ -511,8 +542,18 @@
                 <w:color w:val="BBBBBB"/>
                 <w:sz w:val="20"/>
               </w:rPr>
-              <w:t>Votre réponse...</w:t>
+              <w:t>Your answer...</w:t>
             </w:r>
+          </w:p>
+          <w:p>
+            <w:pPr>
+              <w:spacing w:before="0" w:after="0"/>
+            </w:pPr>
+          </w:p>
+          <w:p>
+            <w:pPr>
+              <w:spacing w:before="0" w:after="0"/>
+            </w:pPr>
           </w:p>
           <w:p>
             <w:pPr>
@@ -553,7 +594,7 @@
           <w:color w:val="1A1A1A"/>
           <w:sz w:val="20"/>
         </w:rPr>
-        <w:t>Existe-t-il des dettes, obligations contractuelles, accords de partage de revenus, litiges en cours ou engagements tiers liés à ce projet ?</w:t>
+        <w:t>You mentioned an admin dashboard as part of the production workflow. Is it part of the main GitHub repository, or a separate tool or service? What is it built with, and does it require any separate credentials or hosting?</w:t>
       </w:r>
     </w:p>
     <w:tbl>
@@ -588,8 +629,13 @@
                 <w:color w:val="BBBBBB"/>
                 <w:sz w:val="20"/>
               </w:rPr>
-              <w:t>Votre réponse...</w:t>
+              <w:t>Your answer...</w:t>
             </w:r>
+          </w:p>
+          <w:p>
+            <w:pPr>
+              <w:spacing w:before="0" w:after="0"/>
+            </w:pPr>
           </w:p>
           <w:p>
             <w:pPr>
@@ -630,7 +676,7 @@
           <w:color w:val="1A1A1A"/>
           <w:sz w:val="20"/>
         </w:rPr>
-        <w:t>Êtes-vous disponible pour accompagner la transition après la vente ? Sous quelle forme (appels, documentation, accès partagé) et sur quelle durée ?</w:t>
+        <w:t>Is the PDF generation step in the production workflow automated within the codebase (e.g. a script, a service, a library), or is it done manually using an external tool?</w:t>
       </w:r>
     </w:p>
     <w:tbl>
@@ -665,7 +711,7 @@
                 <w:color w:val="BBBBBB"/>
                 <w:sz w:val="20"/>
               </w:rPr>
-              <w:t>Votre réponse...</w:t>
+              <w:t>Your answer...</w:t>
             </w:r>
           </w:p>
           <w:p>
@@ -701,35 +747,7 @@
           <w:color w:val="1A3C5E"/>
           <w:sz w:val="24"/>
         </w:rPr>
-        <w:t>B — Questions spécifiques à Talezzi.com</w:t>
-      </w:r>
-    </w:p>
-    <w:p>
-      <w:pPr>
-        <w:spacing w:after="120"/>
-      </w:pPr>
-      <w:r>
-        <w:rPr>
-          <w:rFonts w:ascii="Arial" w:hAnsi="Arial"/>
-          <w:i/>
-          <w:color w:val="444444"/>
-          <w:sz w:val="20"/>
-        </w:rPr>
-        <w:t>Ces questions portent sur les trois aspects qui conditionnent notre décision : la solidité de la fondation narrative, la nature de la production de contenu, et la propreté des droits de propriété intellectuelle.</w:t>
-      </w:r>
-    </w:p>
-    <w:p>
-      <w:pPr>
-        <w:spacing w:before="280" w:after="40"/>
-      </w:pPr>
-      <w:r>
-        <w:rPr>
-          <w:rFonts w:ascii="Arial" w:hAnsi="Arial"/>
-          <w:b/>
-          <w:color w:val="2E6DA4"/>
-          <w:sz w:val="20"/>
-        </w:rPr>
-        <w:t>B1 — Universe Bible et production de contenu</w:t>
+        <w:t>C — Universe &amp; Scalability</w:t>
       </w:r>
     </w:p>
     <w:p>
@@ -752,7 +770,7 @@
           <w:color w:val="1A1A1A"/>
           <w:sz w:val="20"/>
         </w:rPr>
-        <w:t>Pouvez-vous décrire la structure de l'Universe Bible ? Qu'est-ce qu'elle contient concrètement — règles narratives, personnages, univers, contraintes de ton — et comment est-elle organisée ?</w:t>
+        <w:t>Is the Universe Bible and its storytelling formula specific to The Cloudlands, or was it designed as a reusable framework that could support entirely new, independent universes with different characters and settings?</w:t>
       </w:r>
     </w:p>
     <w:p>
@@ -763,10 +781,10 @@
         <w:rPr>
           <w:rFonts w:ascii="Arial" w:hAnsi="Arial"/>
           <w:i/>
-          <w:color w:val="666666"/>
+          <w:color w:val="555555"/>
           <w:sz w:val="18"/>
         </w:rPr>
-        <w:t xml:space="preserve">  Nous cherchons à comprendre si elle peut guider la création de nouvelles histoires de manière autonome, ou si elle suppose une connaissance implicite de votre part.</w:t>
+        <w:t xml:space="preserve">  We're interested in the structural intent behind the Bible, not just its current content.</w:t>
       </w:r>
     </w:p>
     <w:tbl>
@@ -801,18 +819,8 @@
                 <w:color w:val="BBBBBB"/>
                 <w:sz w:val="20"/>
               </w:rPr>
-              <w:t>Votre réponse...</w:t>
+              <w:t>Your answer...</w:t>
             </w:r>
-          </w:p>
-          <w:p>
-            <w:pPr>
-              <w:spacing w:before="0" w:after="0"/>
-            </w:pPr>
-          </w:p>
-          <w:p>
-            <w:pPr>
-              <w:spacing w:before="0" w:after="0"/>
-            </w:pPr>
           </w:p>
           <w:p>
             <w:pPr>
@@ -863,21 +871,7 @@
           <w:color w:val="1A1A1A"/>
           <w:sz w:val="20"/>
         </w:rPr>
-        <w:t>Quel est le workflow complet de production d'une nouvelle histoire : de l'idée initiale jusqu'à la publication sur la plateforme, en passant par la traduction et l'intégration ? Qui fait quoi, et combien de temps chaque étape prend-elle ?</w:t>
-      </w:r>
-    </w:p>
-    <w:p>
-      <w:pPr>
-        <w:spacing w:before="40" w:after="40"/>
-      </w:pPr>
-      <w:r>
-        <w:rPr>
-          <w:rFonts w:ascii="Arial" w:hAnsi="Arial"/>
-          <w:i/>
-          <w:color w:val="666666"/>
-          <w:sz w:val="18"/>
-        </w:rPr>
-        <w:t xml:space="preserve">  Détaillez autant que possible — nous voulons comprendre ce qui est manuel, ce qui est outillé, et ce qui pourrait être délégué.</w:t>
+        <w:t>Beyond the Universe Bible itself, is there any additional documentation — prompt templates, editorial guidelines, production notes, AI prompt structures — that captures the workflow you used to create content? In other words: what would someone need to replicate your process without you being there?</w:t>
       </w:r>
     </w:p>
     <w:tbl>
@@ -912,7 +906,7 @@
                 <w:color w:val="BBBBBB"/>
                 <w:sz w:val="20"/>
               </w:rPr>
-              <w:t>Votre réponse...</w:t>
+              <w:t>Your answer...</w:t>
             </w:r>
           </w:p>
           <w:p>
@@ -929,6 +923,114 @@
             <w:pPr>
               <w:spacing w:before="0" w:after="0"/>
             </w:pPr>
+          </w:p>
+          <w:p>
+            <w:pPr>
+              <w:spacing w:before="0" w:after="0"/>
+            </w:pPr>
+          </w:p>
+          <w:p>
+            <w:pPr>
+              <w:spacing w:before="0" w:after="0"/>
+            </w:pPr>
+          </w:p>
+          <w:p>
+            <w:pPr>
+              <w:spacing w:before="0" w:after="0"/>
+            </w:pPr>
+          </w:p>
+        </w:tc>
+      </w:tr>
+    </w:tbl>
+    <w:p/>
+    <w:p>
+      <w:pPr>
+        <w:spacing w:before="360" w:after="80"/>
+        <w:pBdr>
+          <w:bottom w:val="single" w:sz="6" w:space="1" w:color="1A3C5E"/>
+        </w:pBdr>
+      </w:pPr>
+      <w:r>
+        <w:rPr>
+          <w:rFonts w:ascii="Arial" w:hAnsi="Arial"/>
+          <w:b/>
+          <w:color w:val="1A3C5E"/>
+          <w:sz w:val="24"/>
+        </w:rPr>
+        <w:t>D — IP &amp; Commercial Rights</w:t>
+      </w:r>
+    </w:p>
+    <w:p>
+      <w:pPr>
+        <w:spacing w:before="200" w:after="40"/>
+      </w:pPr>
+      <w:r>
+        <w:rPr>
+          <w:rFonts w:ascii="Arial" w:hAnsi="Arial"/>
+          <w:b/>
+          <w:color w:val="1A3C5E"/>
+          <w:sz w:val="20"/>
+        </w:rPr>
+        <w:t xml:space="preserve">Q8. </w:t>
+      </w:r>
+      <w:r>
+        <w:rPr>
+          <w:rFonts w:ascii="Arial" w:hAnsi="Arial"/>
+          <w:b/>
+          <w:color w:val="1A1A1A"/>
+          <w:sz w:val="20"/>
+        </w:rPr>
+        <w:t>Since the stories were created with significant AI assistance (Claude by Anthropic), are you aware of any restrictions on the commercial exploitation of AI-assisted content under the terms of service of the tools used? We'd like the purchase agreement to explicitly address ownership and commercial use rights for all AI-assisted content. Are you comfortable with that?</w:t>
+      </w:r>
+    </w:p>
+    <w:p>
+      <w:pPr>
+        <w:spacing w:before="40" w:after="40"/>
+      </w:pPr>
+      <w:r>
+        <w:rPr>
+          <w:rFonts w:ascii="Arial" w:hAnsi="Arial"/>
+          <w:i/>
+          <w:color w:val="555555"/>
+          <w:sz w:val="18"/>
+        </w:rPr>
+        <w:t xml:space="preserve">  This is standard practice when AI tools are involved — not a concern about your process, just due diligence on our end.</w:t>
+      </w:r>
+    </w:p>
+    <w:tbl>
+      <w:tblPr>
+        <w:tblStyle w:val="TableGrid"/>
+        <w:tblW w:type="auto" w:w="0"/>
+        <w:tblLook w:firstColumn="1" w:firstRow="1" w:lastColumn="0" w:lastRow="0" w:noHBand="0" w:noVBand="1" w:val="04A0"/>
+      </w:tblPr>
+      <w:tblGrid>
+        <w:gridCol w:w="9406"/>
+      </w:tblGrid>
+      <w:tr>
+        <w:tc>
+          <w:tcPr>
+            <w:tcW w:type="dxa" w:w="9072"/>
+            <w:shd w:val="clear" w:color="auto" w:fill="F5F8FB"/>
+            <w:tcBorders>
+              <w:top w:val="single" w:sz="4" w:space="0" w:color="C5D5E8"/>
+              <w:left w:val="single" w:sz="4" w:space="0" w:color="C5D5E8"/>
+              <w:bottom w:val="single" w:sz="4" w:space="0" w:color="C5D5E8"/>
+              <w:right w:val="single" w:sz="4" w:space="0" w:color="C5D5E8"/>
+            </w:tcBorders>
+          </w:tcPr>
+          <w:p>
+            <w:pPr>
+              <w:spacing w:before="80" w:after="80"/>
+            </w:pPr>
+            <w:r>
+              <w:rPr>
+                <w:rFonts w:ascii="Arial" w:hAnsi="Arial"/>
+                <w:i/>
+                <w:color w:val="BBBBBB"/>
+                <w:sz w:val="20"/>
+              </w:rPr>
+              <w:t>Your answer...</w:t>
+            </w:r>
           </w:p>
           <w:p>
             <w:pPr>
@@ -970,7 +1072,7 @@
           <w:color w:val="1A3C5E"/>
           <w:sz w:val="20"/>
         </w:rPr>
-        <w:t xml:space="preserve">Q8. </w:t>
+        <w:t xml:space="preserve">Q9. </w:t>
       </w:r>
       <w:r>
         <w:rPr>
@@ -979,21 +1081,7 @@
           <w:color w:val="1A1A1A"/>
           <w:sz w:val="20"/>
         </w:rPr>
-        <w:t>Des outils d'intelligence artificielle ont-ils été utilisés dans la création des histoires, des traductions ou des illustrations ? Si oui, lesquels, à quelle étape, et sous quelles conditions d'utilisation ?</w:t>
-      </w:r>
-    </w:p>
-    <w:p>
-      <w:pPr>
-        <w:spacing w:before="40" w:after="40"/>
-      </w:pPr>
-      <w:r>
-        <w:rPr>
-          <w:rFonts w:ascii="Arial" w:hAnsi="Arial"/>
-          <w:i/>
-          <w:color w:val="666666"/>
-          <w:sz w:val="18"/>
-        </w:rPr>
-        <w:t xml:space="preserve">  Cette question est importante pour évaluer la reproductibilité du processus et la conformité des droits d'utilisation commerciale.</w:t>
+        <w:t>Has the name 'Talezzi', the logo, or any brand elements been registered as a trademark, or checked for availability in target markets (EU, UK, US)? Is there anything that would prevent us from using or registering these elements after the sale?</w:t>
       </w:r>
     </w:p>
     <w:tbl>
@@ -1028,18 +1116,8 @@
                 <w:color w:val="BBBBBB"/>
                 <w:sz w:val="20"/>
               </w:rPr>
-              <w:t>Votre réponse...</w:t>
+              <w:t>Your answer...</w:t>
             </w:r>
-          </w:p>
-          <w:p>
-            <w:pPr>
-              <w:spacing w:before="0" w:after="0"/>
-            </w:pPr>
-          </w:p>
-          <w:p>
-            <w:pPr>
-              <w:spacing w:before="0" w:after="0"/>
-            </w:pPr>
           </w:p>
           <w:p>
             <w:pPr>
@@ -1067,16 +1145,19 @@
     <w:p/>
     <w:p>
       <w:pPr>
-        <w:spacing w:before="280" w:after="40"/>
+        <w:spacing w:before="360" w:after="80"/>
+        <w:pBdr>
+          <w:bottom w:val="single" w:sz="6" w:space="1" w:color="1A3C5E"/>
+        </w:pBdr>
       </w:pPr>
       <w:r>
         <w:rPr>
           <w:rFonts w:ascii="Arial" w:hAnsi="Arial"/>
           <w:b/>
-          <w:color w:val="2E6DA4"/>
-          <w:sz w:val="20"/>
+          <w:color w:val="1A3C5E"/>
+          <w:sz w:val="24"/>
         </w:rPr>
-        <w:t>B2 — Propriété intellectuelle et droits d'exploitation</w:t>
+        <w:t>E — Technical &amp; Infrastructure</w:t>
       </w:r>
     </w:p>
     <w:p>
@@ -1090,7 +1171,7 @@
           <w:color w:val="1A3C5E"/>
           <w:sz w:val="20"/>
         </w:rPr>
-        <w:t xml:space="preserve">Q9. </w:t>
+        <w:t xml:space="preserve">Q10. </w:t>
       </w:r>
       <w:r>
         <w:rPr>
@@ -1099,21 +1180,7 @@
           <w:color w:val="1A1A1A"/>
           <w:sz w:val="20"/>
         </w:rPr>
-        <w:t>Qui a créé les histoires, les illustrations et les contenus inclus dans la vente ? Disposez-vous de documents attestant la cession de ces droits (contrats, factures avec mention de cession, conditions d'utilisation des outils IA) ?</w:t>
-      </w:r>
-    </w:p>
-    <w:p>
-      <w:pPr>
-        <w:spacing w:before="40" w:after="40"/>
-      </w:pPr>
-      <w:r>
-        <w:rPr>
-          <w:rFonts w:ascii="Arial" w:hAnsi="Arial"/>
-          <w:i/>
-          <w:color w:val="666666"/>
-          <w:sz w:val="18"/>
-        </w:rPr>
-        <w:t xml:space="preserve">  Nous avons besoin de cette clarté pour évaluer les possibilités d'exploitation sur différents canaux et formats.</w:t>
+        <w:t>Stripe is integrated but not activated. Is activation simply a matter of swapping in our own API keys, or does it require additional development work (webhooks, business verification, product/pricing configuration, etc.)?</w:t>
       </w:r>
     </w:p>
     <w:tbl>
@@ -1148,286 +1215,7 @@
                 <w:color w:val="BBBBBB"/>
                 <w:sz w:val="20"/>
               </w:rPr>
-              <w:t>Votre réponse...</w:t>
-            </w:r>
-          </w:p>
-          <w:p>
-            <w:pPr>
-              <w:spacing w:before="0" w:after="0"/>
-            </w:pPr>
-          </w:p>
-          <w:p>
-            <w:pPr>
-              <w:spacing w:before="0" w:after="0"/>
-            </w:pPr>
-          </w:p>
-          <w:p>
-            <w:pPr>
-              <w:spacing w:before="0" w:after="0"/>
-            </w:pPr>
-          </w:p>
-          <w:p>
-            <w:pPr>
-              <w:spacing w:before="0" w:after="0"/>
-            </w:pPr>
-          </w:p>
-          <w:p>
-            <w:pPr>
-              <w:spacing w:before="0" w:after="0"/>
-            </w:pPr>
-          </w:p>
-          <w:p>
-            <w:pPr>
-              <w:spacing w:before="0" w:after="0"/>
-            </w:pPr>
-          </w:p>
-        </w:tc>
-      </w:tr>
-    </w:tbl>
-    <w:p/>
-    <w:p>
-      <w:pPr>
-        <w:spacing w:before="200" w:after="40"/>
-      </w:pPr>
-      <w:r>
-        <w:rPr>
-          <w:rFonts w:ascii="Arial" w:hAnsi="Arial"/>
-          <w:b/>
-          <w:color w:val="1A3C5E"/>
-          <w:sz w:val="20"/>
-        </w:rPr>
-        <w:t xml:space="preserve">Q10. </w:t>
-      </w:r>
-      <w:r>
-        <w:rPr>
-          <w:rFonts w:ascii="Arial" w:hAnsi="Arial"/>
-          <w:b/>
-          <w:color w:val="1A1A1A"/>
-          <w:sz w:val="20"/>
-        </w:rPr>
-        <w:t>Le nom 'Talezzi', le logo et l'identité visuelle ont-ils fait l'objet d'un dépôt de marque ou d'une vérification de disponibilité ? Êtes-vous en mesure de céder l'ensemble de ces éléments sans restriction ?</w:t>
-      </w:r>
-    </w:p>
-    <w:tbl>
-      <w:tblPr>
-        <w:tblStyle w:val="TableGrid"/>
-        <w:tblW w:type="auto" w:w="0"/>
-        <w:tblLook w:firstColumn="1" w:firstRow="1" w:lastColumn="0" w:lastRow="0" w:noHBand="0" w:noVBand="1" w:val="04A0"/>
-      </w:tblPr>
-      <w:tblGrid>
-        <w:gridCol w:w="9406"/>
-      </w:tblGrid>
-      <w:tr>
-        <w:tc>
-          <w:tcPr>
-            <w:tcW w:type="dxa" w:w="9072"/>
-            <w:shd w:val="clear" w:color="auto" w:fill="F5F8FB"/>
-            <w:tcBorders>
-              <w:top w:val="single" w:sz="4" w:space="0" w:color="C5D5E8"/>
-              <w:left w:val="single" w:sz="4" w:space="0" w:color="C5D5E8"/>
-              <w:bottom w:val="single" w:sz="4" w:space="0" w:color="C5D5E8"/>
-              <w:right w:val="single" w:sz="4" w:space="0" w:color="C5D5E8"/>
-            </w:tcBorders>
-          </w:tcPr>
-          <w:p>
-            <w:pPr>
-              <w:spacing w:before="80" w:after="80"/>
-            </w:pPr>
-            <w:r>
-              <w:rPr>
-                <w:rFonts w:ascii="Arial" w:hAnsi="Arial"/>
-                <w:i/>
-                <w:color w:val="BBBBBB"/>
-                <w:sz w:val="20"/>
-              </w:rPr>
-              <w:t>Votre réponse...</w:t>
-            </w:r>
-          </w:p>
-          <w:p>
-            <w:pPr>
-              <w:spacing w:before="0" w:after="0"/>
-            </w:pPr>
-          </w:p>
-          <w:p>
-            <w:pPr>
-              <w:spacing w:before="0" w:after="0"/>
-            </w:pPr>
-          </w:p>
-          <w:p>
-            <w:pPr>
-              <w:spacing w:before="0" w:after="0"/>
-            </w:pPr>
-          </w:p>
-          <w:p>
-            <w:pPr>
-              <w:spacing w:before="0" w:after="0"/>
-            </w:pPr>
-          </w:p>
-        </w:tc>
-      </w:tr>
-    </w:tbl>
-    <w:p/>
-    <w:p>
-      <w:pPr>
-        <w:spacing w:before="280" w:after="40"/>
-      </w:pPr>
-      <w:r>
-        <w:rPr>
-          <w:rFonts w:ascii="Arial" w:hAnsi="Arial"/>
-          <w:b/>
-          <w:color w:val="2E6DA4"/>
-          <w:sz w:val="20"/>
-        </w:rPr>
-        <w:t>B3 — Accès technique et infrastructure</w:t>
-      </w:r>
-    </w:p>
-    <w:p>
-      <w:pPr>
-        <w:spacing w:before="200" w:after="40"/>
-      </w:pPr>
-      <w:r>
-        <w:rPr>
-          <w:rFonts w:ascii="Arial" w:hAnsi="Arial"/>
-          <w:b/>
-          <w:color w:val="1A3C5E"/>
-          <w:sz w:val="20"/>
-        </w:rPr>
-        <w:t xml:space="preserve">Q11. </w:t>
-      </w:r>
-      <w:r>
-        <w:rPr>
-          <w:rFonts w:ascii="Arial" w:hAnsi="Arial"/>
-          <w:b/>
-          <w:color w:val="1A1A1A"/>
-          <w:sz w:val="20"/>
-        </w:rPr>
-        <w:t>Pouvez-vous nous donner un accès en lecture au dépôt GitHub dans le cadre de la due diligence ? Quelles sont vos conditions pour cela ?</w:t>
-      </w:r>
-    </w:p>
-    <w:p>
-      <w:pPr>
-        <w:spacing w:before="40" w:after="40"/>
-      </w:pPr>
-      <w:r>
-        <w:rPr>
-          <w:rFonts w:ascii="Arial" w:hAnsi="Arial"/>
-          <w:i/>
-          <w:color w:val="666666"/>
-          <w:sz w:val="18"/>
-        </w:rPr>
-        <w:t xml:space="preserve">  Accès en lecture seule, à révoquer après la phase de due diligence si la vente n'aboutit pas.</w:t>
-      </w:r>
-    </w:p>
-    <w:tbl>
-      <w:tblPr>
-        <w:tblStyle w:val="TableGrid"/>
-        <w:tblW w:type="auto" w:w="0"/>
-        <w:tblLook w:firstColumn="1" w:firstRow="1" w:lastColumn="0" w:lastRow="0" w:noHBand="0" w:noVBand="1" w:val="04A0"/>
-      </w:tblPr>
-      <w:tblGrid>
-        <w:gridCol w:w="9406"/>
-      </w:tblGrid>
-      <w:tr>
-        <w:tc>
-          <w:tcPr>
-            <w:tcW w:type="dxa" w:w="9072"/>
-            <w:shd w:val="clear" w:color="auto" w:fill="F5F8FB"/>
-            <w:tcBorders>
-              <w:top w:val="single" w:sz="4" w:space="0" w:color="C5D5E8"/>
-              <w:left w:val="single" w:sz="4" w:space="0" w:color="C5D5E8"/>
-              <w:bottom w:val="single" w:sz="4" w:space="0" w:color="C5D5E8"/>
-              <w:right w:val="single" w:sz="4" w:space="0" w:color="C5D5E8"/>
-            </w:tcBorders>
-          </w:tcPr>
-          <w:p>
-            <w:pPr>
-              <w:spacing w:before="80" w:after="80"/>
-            </w:pPr>
-            <w:r>
-              <w:rPr>
-                <w:rFonts w:ascii="Arial" w:hAnsi="Arial"/>
-                <w:i/>
-                <w:color w:val="BBBBBB"/>
-                <w:sz w:val="20"/>
-              </w:rPr>
-              <w:t>Votre réponse...</w:t>
-            </w:r>
-          </w:p>
-          <w:p>
-            <w:pPr>
-              <w:spacing w:before="0" w:after="0"/>
-            </w:pPr>
-          </w:p>
-          <w:p>
-            <w:pPr>
-              <w:spacing w:before="0" w:after="0"/>
-            </w:pPr>
-          </w:p>
-          <w:p>
-            <w:pPr>
-              <w:spacing w:before="0" w:after="0"/>
-            </w:pPr>
-          </w:p>
-        </w:tc>
-      </w:tr>
-    </w:tbl>
-    <w:p/>
-    <w:p>
-      <w:pPr>
-        <w:spacing w:before="200" w:after="40"/>
-      </w:pPr>
-      <w:r>
-        <w:rPr>
-          <w:rFonts w:ascii="Arial" w:hAnsi="Arial"/>
-          <w:b/>
-          <w:color w:val="1A3C5E"/>
-          <w:sz w:val="20"/>
-        </w:rPr>
-        <w:t xml:space="preserve">Q12. </w:t>
-      </w:r>
-      <w:r>
-        <w:rPr>
-          <w:rFonts w:ascii="Arial" w:hAnsi="Arial"/>
-          <w:b/>
-          <w:color w:val="1A1A1A"/>
-          <w:sz w:val="20"/>
-        </w:rPr>
-        <w:t>Stripe est intégré mais non activé. Y a-t-il une raison particulière à cela (technique, légale, calendrier) ? L'activation nécessite-t-elle des développements supplémentaires ou est-elle prête à l'emploi avec de nouvelles clés ?</w:t>
-      </w:r>
-    </w:p>
-    <w:tbl>
-      <w:tblPr>
-        <w:tblStyle w:val="TableGrid"/>
-        <w:tblW w:type="auto" w:w="0"/>
-        <w:tblLook w:firstColumn="1" w:firstRow="1" w:lastColumn="0" w:lastRow="0" w:noHBand="0" w:noVBand="1" w:val="04A0"/>
-      </w:tblPr>
-      <w:tblGrid>
-        <w:gridCol w:w="9406"/>
-      </w:tblGrid>
-      <w:tr>
-        <w:tc>
-          <w:tcPr>
-            <w:tcW w:type="dxa" w:w="9072"/>
-            <w:shd w:val="clear" w:color="auto" w:fill="F5F8FB"/>
-            <w:tcBorders>
-              <w:top w:val="single" w:sz="4" w:space="0" w:color="C5D5E8"/>
-              <w:left w:val="single" w:sz="4" w:space="0" w:color="C5D5E8"/>
-              <w:bottom w:val="single" w:sz="4" w:space="0" w:color="C5D5E8"/>
-              <w:right w:val="single" w:sz="4" w:space="0" w:color="C5D5E8"/>
-            </w:tcBorders>
-          </w:tcPr>
-          <w:p>
-            <w:pPr>
-              <w:spacing w:before="80" w:after="80"/>
-            </w:pPr>
-            <w:r>
-              <w:rPr>
-                <w:rFonts w:ascii="Arial" w:hAnsi="Arial"/>
-                <w:i/>
-                <w:color w:val="BBBBBB"/>
-                <w:sz w:val="20"/>
-              </w:rPr>
-              <w:t>Votre réponse...</w:t>
+              <w:t>Your answer...</w:t>
             </w:r>
           </w:p>
           <w:p>
@@ -1465,7 +1253,7 @@
           <w:color w:val="1A3C5E"/>
           <w:sz w:val="20"/>
         </w:rPr>
-        <w:t xml:space="preserve">Q13. </w:t>
+        <w:t xml:space="preserve">Q11. </w:t>
       </w:r>
       <w:r>
         <w:rPr>
@@ -1474,7 +1262,7 @@
           <w:color w:val="1A1A1A"/>
           <w:sz w:val="20"/>
         </w:rPr>
-        <w:t>Quels services tiers sont actuellement actifs (au-delà de l'hébergement Hetzner et Google Workspace) ? Y a-t-il des APIs, licences logicielles ou abonnements liés au domaine ou au projet que nous devrions reprendre ?</w:t>
+        <w:t>Beyond Hetzner hosting and Google Workspace, are there any other active services, APIs, subscriptions, or third-party integrations we should be aware of — and plan to take over or replace after the handover?</w:t>
       </w:r>
     </w:p>
     <w:tbl>
@@ -1509,7 +1297,7 @@
                 <w:color w:val="BBBBBB"/>
                 <w:sz w:val="20"/>
               </w:rPr>
-              <w:t>Votre réponse...</w:t>
+              <w:t>Your answer...</w:t>
             </w:r>
           </w:p>
           <w:p>
@@ -1557,9 +1345,9 @@
           <w:color w:val="888888"/>
           <w:sz w:val="16"/>
         </w:rPr>
-        <w:t>Document confidentiel — Acquisition Desk · InspirActions · 2026</w:t>
+        <w:t>Confidential — Acquisition Desk · InspirActions · 2026</w:t>
         <w:br/>
-        <w:t>À compléter directement dans ce document et à retourner via Google Drive.</w:t>
+        <w:t>Please complete directly in this document and return via Google Drive.</w:t>
       </w:r>
     </w:p>
     <w:sectPr>

</xml_diff>